<commit_message>
Corrected IODP U1429 depth variable
</commit_message>
<xml_diff>
--- a/AC_essential/README.docx
+++ b/AC_essential/README.docx
@@ -74,15 +74,7 @@
           <w:color w:val="555555"/>
           <w:sz w:val="20"/>
         </w:rPr>
-        <w:t>Jerry McManus (paleoceanography and data)</w:t>
-      </w:r>
-      <w:r>
-        <w:rPr>
-          <w:i/>
-          <w:color w:val="555555"/>
-          <w:sz w:val="20"/>
-        </w:rPr>
-        <w:t xml:space="preserve"> &amp; Alexey</w:t>
+        <w:t>Jerry McManus (paleoceanography and data) &amp; Alexey</w:t>
       </w:r>
       <w:r>
         <w:rPr>
@@ -104,6 +96,13 @@
           <w:sz w:val="20"/>
         </w:rPr>
         <w:t>Compiled 21 July 2026</w:t>
+      </w:r>
+      <w:r>
+        <w:rPr>
+          <w:color w:val="555555"/>
+          <w:sz w:val="20"/>
+        </w:rPr>
+        <w:t xml:space="preserve"> with support from Claude Opus 4.8</w:t>
       </w:r>
     </w:p>
     <w:p>
@@ -616,7 +615,7 @@
           </w:tcPr>
           <w:p>
             <w:pPr>
-              <w:spacing w:after="40" w:line="240" w:lineRule="auto"/>
+              <w:spacing w:after="40"/>
             </w:pPr>
             <w:r>
               <w:rPr>
@@ -632,7 +631,7 @@
           </w:tcPr>
           <w:p>
             <w:pPr>
-              <w:spacing w:after="40" w:line="240" w:lineRule="auto"/>
+              <w:spacing w:after="40"/>
               <w:jc w:val="center"/>
             </w:pPr>
             <w:r>
@@ -649,7 +648,7 @@
           </w:tcPr>
           <w:p>
             <w:pPr>
-              <w:spacing w:after="40" w:line="240" w:lineRule="auto"/>
+              <w:spacing w:after="40"/>
               <w:jc w:val="center"/>
             </w:pPr>
             <w:r>
@@ -666,7 +665,7 @@
           </w:tcPr>
           <w:p>
             <w:pPr>
-              <w:spacing w:after="40" w:line="240" w:lineRule="auto"/>
+              <w:spacing w:after="40"/>
               <w:jc w:val="center"/>
             </w:pPr>
             <w:r>
@@ -683,7 +682,7 @@
           </w:tcPr>
           <w:p>
             <w:pPr>
-              <w:spacing w:after="40" w:line="240" w:lineRule="auto"/>
+              <w:spacing w:after="40"/>
               <w:jc w:val="center"/>
             </w:pPr>
             <w:r>
@@ -700,7 +699,7 @@
           </w:tcPr>
           <w:p>
             <w:pPr>
-              <w:spacing w:after="40" w:line="240" w:lineRule="auto"/>
+              <w:spacing w:after="40"/>
               <w:jc w:val="center"/>
             </w:pPr>
             <w:r>
@@ -717,7 +716,7 @@
           </w:tcPr>
           <w:p>
             <w:pPr>
-              <w:spacing w:after="40" w:line="240" w:lineRule="auto"/>
+              <w:spacing w:after="40"/>
               <w:jc w:val="center"/>
             </w:pPr>
             <w:r>
@@ -734,7 +733,7 @@
           </w:tcPr>
           <w:p>
             <w:pPr>
-              <w:spacing w:after="40" w:line="240" w:lineRule="auto"/>
+              <w:spacing w:after="40"/>
               <w:jc w:val="center"/>
             </w:pPr>
             <w:r>
@@ -751,7 +750,7 @@
           </w:tcPr>
           <w:p>
             <w:pPr>
-              <w:spacing w:after="40" w:line="240" w:lineRule="auto"/>
+              <w:spacing w:after="40"/>
               <w:jc w:val="center"/>
             </w:pPr>
             <w:r>
@@ -774,7 +773,7 @@
           </w:tcPr>
           <w:p>
             <w:pPr>
-              <w:spacing w:after="40" w:line="240" w:lineRule="auto"/>
+              <w:spacing w:after="40"/>
             </w:pPr>
             <w:r>
               <w:rPr>
@@ -791,7 +790,7 @@
           </w:tcPr>
           <w:p>
             <w:pPr>
-              <w:spacing w:after="40" w:line="240" w:lineRule="auto"/>
+              <w:spacing w:after="40"/>
               <w:jc w:val="center"/>
             </w:pPr>
             <w:r>
@@ -809,7 +808,7 @@
           </w:tcPr>
           <w:p>
             <w:pPr>
-              <w:spacing w:after="40" w:line="240" w:lineRule="auto"/>
+              <w:spacing w:after="40"/>
               <w:jc w:val="center"/>
             </w:pPr>
             <w:r>
@@ -827,7 +826,7 @@
           </w:tcPr>
           <w:p>
             <w:pPr>
-              <w:spacing w:after="40" w:line="240" w:lineRule="auto"/>
+              <w:spacing w:after="40"/>
               <w:jc w:val="center"/>
             </w:pPr>
             <w:r>
@@ -845,7 +844,7 @@
           </w:tcPr>
           <w:p>
             <w:pPr>
-              <w:spacing w:after="40" w:line="240" w:lineRule="auto"/>
+              <w:spacing w:after="40"/>
               <w:jc w:val="center"/>
             </w:pPr>
             <w:r>
@@ -863,7 +862,7 @@
           </w:tcPr>
           <w:p>
             <w:pPr>
-              <w:spacing w:after="40" w:line="240" w:lineRule="auto"/>
+              <w:spacing w:after="40"/>
               <w:jc w:val="center"/>
             </w:pPr>
             <w:r>
@@ -881,7 +880,7 @@
           </w:tcPr>
           <w:p>
             <w:pPr>
-              <w:spacing w:after="40" w:line="240" w:lineRule="auto"/>
+              <w:spacing w:after="40"/>
               <w:jc w:val="center"/>
             </w:pPr>
             <w:r>
@@ -899,7 +898,7 @@
           </w:tcPr>
           <w:p>
             <w:pPr>
-              <w:spacing w:after="40" w:line="240" w:lineRule="auto"/>
+              <w:spacing w:after="40"/>
               <w:jc w:val="center"/>
             </w:pPr>
             <w:r>
@@ -917,7 +916,7 @@
           </w:tcPr>
           <w:p>
             <w:pPr>
-              <w:spacing w:after="40" w:line="240" w:lineRule="auto"/>
+              <w:spacing w:after="40"/>
               <w:jc w:val="center"/>
             </w:pPr>
             <w:r>
@@ -939,7 +938,7 @@
           </w:tcPr>
           <w:p>
             <w:pPr>
-              <w:spacing w:after="40" w:line="240" w:lineRule="auto"/>
+              <w:spacing w:after="40"/>
             </w:pPr>
             <w:r>
               <w:rPr>
@@ -955,7 +954,7 @@
           </w:tcPr>
           <w:p>
             <w:pPr>
-              <w:spacing w:after="40" w:line="240" w:lineRule="auto"/>
+              <w:spacing w:after="40"/>
               <w:jc w:val="center"/>
             </w:pPr>
             <w:r>
@@ -972,7 +971,7 @@
           </w:tcPr>
           <w:p>
             <w:pPr>
-              <w:spacing w:after="40" w:line="240" w:lineRule="auto"/>
+              <w:spacing w:after="40"/>
               <w:jc w:val="center"/>
             </w:pPr>
             <w:r>
@@ -989,7 +988,7 @@
           </w:tcPr>
           <w:p>
             <w:pPr>
-              <w:spacing w:after="40" w:line="240" w:lineRule="auto"/>
+              <w:spacing w:after="40"/>
               <w:jc w:val="center"/>
             </w:pPr>
             <w:r>
@@ -1006,7 +1005,7 @@
           </w:tcPr>
           <w:p>
             <w:pPr>
-              <w:spacing w:after="40" w:line="240" w:lineRule="auto"/>
+              <w:spacing w:after="40"/>
               <w:jc w:val="center"/>
             </w:pPr>
             <w:r>
@@ -1023,7 +1022,7 @@
           </w:tcPr>
           <w:p>
             <w:pPr>
-              <w:spacing w:after="40" w:line="240" w:lineRule="auto"/>
+              <w:spacing w:after="40"/>
               <w:jc w:val="center"/>
             </w:pPr>
             <w:r>
@@ -1040,7 +1039,7 @@
           </w:tcPr>
           <w:p>
             <w:pPr>
-              <w:spacing w:after="40" w:line="240" w:lineRule="auto"/>
+              <w:spacing w:after="40"/>
               <w:jc w:val="center"/>
             </w:pPr>
             <w:r>
@@ -1057,7 +1056,7 @@
           </w:tcPr>
           <w:p>
             <w:pPr>
-              <w:spacing w:after="40" w:line="240" w:lineRule="auto"/>
+              <w:spacing w:after="40"/>
               <w:jc w:val="center"/>
             </w:pPr>
             <w:r>
@@ -1074,7 +1073,7 @@
           </w:tcPr>
           <w:p>
             <w:pPr>
-              <w:spacing w:after="40" w:line="240" w:lineRule="auto"/>
+              <w:spacing w:after="40"/>
               <w:jc w:val="center"/>
             </w:pPr>
             <w:r>
@@ -1097,7 +1096,7 @@
           </w:tcPr>
           <w:p>
             <w:pPr>
-              <w:spacing w:after="40" w:line="240" w:lineRule="auto"/>
+              <w:spacing w:after="40"/>
             </w:pPr>
             <w:r>
               <w:rPr>
@@ -1114,7 +1113,7 @@
           </w:tcPr>
           <w:p>
             <w:pPr>
-              <w:spacing w:after="40" w:line="240" w:lineRule="auto"/>
+              <w:spacing w:after="40"/>
               <w:jc w:val="center"/>
             </w:pPr>
             <w:r>
@@ -1132,7 +1131,7 @@
           </w:tcPr>
           <w:p>
             <w:pPr>
-              <w:spacing w:after="40" w:line="240" w:lineRule="auto"/>
+              <w:spacing w:after="40"/>
               <w:jc w:val="center"/>
             </w:pPr>
             <w:r>
@@ -1150,7 +1149,7 @@
           </w:tcPr>
           <w:p>
             <w:pPr>
-              <w:spacing w:after="40" w:line="240" w:lineRule="auto"/>
+              <w:spacing w:after="40"/>
               <w:jc w:val="center"/>
             </w:pPr>
             <w:r>
@@ -1168,7 +1167,7 @@
           </w:tcPr>
           <w:p>
             <w:pPr>
-              <w:spacing w:after="40" w:line="240" w:lineRule="auto"/>
+              <w:spacing w:after="40"/>
               <w:jc w:val="center"/>
             </w:pPr>
             <w:r>
@@ -1186,7 +1185,7 @@
           </w:tcPr>
           <w:p>
             <w:pPr>
-              <w:spacing w:after="40" w:line="240" w:lineRule="auto"/>
+              <w:spacing w:after="40"/>
               <w:jc w:val="center"/>
             </w:pPr>
             <w:r>
@@ -1204,7 +1203,7 @@
           </w:tcPr>
           <w:p>
             <w:pPr>
-              <w:spacing w:after="40" w:line="240" w:lineRule="auto"/>
+              <w:spacing w:after="40"/>
               <w:jc w:val="center"/>
             </w:pPr>
             <w:r>
@@ -1222,7 +1221,7 @@
           </w:tcPr>
           <w:p>
             <w:pPr>
-              <w:spacing w:after="40" w:line="240" w:lineRule="auto"/>
+              <w:spacing w:after="40"/>
               <w:jc w:val="center"/>
             </w:pPr>
             <w:r>
@@ -1240,7 +1239,7 @@
           </w:tcPr>
           <w:p>
             <w:pPr>
-              <w:spacing w:after="40" w:line="240" w:lineRule="auto"/>
+              <w:spacing w:after="40"/>
               <w:jc w:val="center"/>
             </w:pPr>
             <w:r>
@@ -1262,7 +1261,7 @@
           </w:tcPr>
           <w:p>
             <w:pPr>
-              <w:spacing w:after="40" w:line="240" w:lineRule="auto"/>
+              <w:spacing w:after="40"/>
             </w:pPr>
             <w:r>
               <w:rPr>
@@ -1278,7 +1277,7 @@
           </w:tcPr>
           <w:p>
             <w:pPr>
-              <w:spacing w:after="40" w:line="240" w:lineRule="auto"/>
+              <w:spacing w:after="40"/>
               <w:jc w:val="center"/>
             </w:pPr>
             <w:r>
@@ -1295,7 +1294,7 @@
           </w:tcPr>
           <w:p>
             <w:pPr>
-              <w:spacing w:after="40" w:line="240" w:lineRule="auto"/>
+              <w:spacing w:after="40"/>
               <w:jc w:val="center"/>
             </w:pPr>
             <w:r>
@@ -1312,7 +1311,7 @@
           </w:tcPr>
           <w:p>
             <w:pPr>
-              <w:spacing w:after="40" w:line="240" w:lineRule="auto"/>
+              <w:spacing w:after="40"/>
               <w:jc w:val="center"/>
             </w:pPr>
             <w:r>
@@ -1329,7 +1328,7 @@
           </w:tcPr>
           <w:p>
             <w:pPr>
-              <w:spacing w:after="40" w:line="240" w:lineRule="auto"/>
+              <w:spacing w:after="40"/>
               <w:jc w:val="center"/>
             </w:pPr>
             <w:r>
@@ -1346,7 +1345,7 @@
           </w:tcPr>
           <w:p>
             <w:pPr>
-              <w:spacing w:after="40" w:line="240" w:lineRule="auto"/>
+              <w:spacing w:after="40"/>
               <w:jc w:val="center"/>
             </w:pPr>
             <w:r>
@@ -1363,7 +1362,7 @@
           </w:tcPr>
           <w:p>
             <w:pPr>
-              <w:spacing w:after="40" w:line="240" w:lineRule="auto"/>
+              <w:spacing w:after="40"/>
               <w:jc w:val="center"/>
             </w:pPr>
             <w:r>
@@ -1380,7 +1379,7 @@
           </w:tcPr>
           <w:p>
             <w:pPr>
-              <w:spacing w:after="40" w:line="240" w:lineRule="auto"/>
+              <w:spacing w:after="40"/>
               <w:jc w:val="center"/>
             </w:pPr>
             <w:r>
@@ -1397,7 +1396,7 @@
           </w:tcPr>
           <w:p>
             <w:pPr>
-              <w:spacing w:after="40" w:line="240" w:lineRule="auto"/>
+              <w:spacing w:after="40"/>
               <w:jc w:val="center"/>
             </w:pPr>
             <w:r>
@@ -1420,7 +1419,7 @@
           </w:tcPr>
           <w:p>
             <w:pPr>
-              <w:spacing w:after="40" w:line="240" w:lineRule="auto"/>
+              <w:spacing w:after="40"/>
             </w:pPr>
             <w:r>
               <w:rPr>
@@ -1437,7 +1436,7 @@
           </w:tcPr>
           <w:p>
             <w:pPr>
-              <w:spacing w:after="40" w:line="240" w:lineRule="auto"/>
+              <w:spacing w:after="40"/>
               <w:jc w:val="center"/>
             </w:pPr>
             <w:r>
@@ -1455,7 +1454,7 @@
           </w:tcPr>
           <w:p>
             <w:pPr>
-              <w:spacing w:after="40" w:line="240" w:lineRule="auto"/>
+              <w:spacing w:after="40"/>
               <w:jc w:val="center"/>
             </w:pPr>
             <w:r>
@@ -1473,7 +1472,7 @@
           </w:tcPr>
           <w:p>
             <w:pPr>
-              <w:spacing w:after="40" w:line="240" w:lineRule="auto"/>
+              <w:spacing w:after="40"/>
               <w:jc w:val="center"/>
             </w:pPr>
             <w:r>
@@ -1491,7 +1490,7 @@
           </w:tcPr>
           <w:p>
             <w:pPr>
-              <w:spacing w:after="40" w:line="240" w:lineRule="auto"/>
+              <w:spacing w:after="40"/>
               <w:jc w:val="center"/>
             </w:pPr>
             <w:r>
@@ -1509,7 +1508,7 @@
           </w:tcPr>
           <w:p>
             <w:pPr>
-              <w:spacing w:after="40" w:line="240" w:lineRule="auto"/>
+              <w:spacing w:after="40"/>
               <w:jc w:val="center"/>
             </w:pPr>
             <w:r>
@@ -1527,7 +1526,7 @@
           </w:tcPr>
           <w:p>
             <w:pPr>
-              <w:spacing w:after="40" w:line="240" w:lineRule="auto"/>
+              <w:spacing w:after="40"/>
               <w:jc w:val="center"/>
             </w:pPr>
             <w:r>
@@ -1545,7 +1544,7 @@
           </w:tcPr>
           <w:p>
             <w:pPr>
-              <w:spacing w:after="40" w:line="240" w:lineRule="auto"/>
+              <w:spacing w:after="40"/>
               <w:jc w:val="center"/>
             </w:pPr>
             <w:r>
@@ -1563,7 +1562,7 @@
           </w:tcPr>
           <w:p>
             <w:pPr>
-              <w:spacing w:after="40" w:line="240" w:lineRule="auto"/>
+              <w:spacing w:after="40"/>
               <w:jc w:val="center"/>
             </w:pPr>
             <w:r>
@@ -1776,7 +1775,7 @@
           </w:tcPr>
           <w:p>
             <w:pPr>
-              <w:spacing w:after="40" w:line="240" w:lineRule="auto"/>
+              <w:spacing w:after="40"/>
             </w:pPr>
             <w:r>
               <w:rPr>
@@ -1792,7 +1791,7 @@
           </w:tcPr>
           <w:p>
             <w:pPr>
-              <w:spacing w:after="40" w:line="240" w:lineRule="auto"/>
+              <w:spacing w:after="40"/>
             </w:pPr>
             <w:r>
               <w:rPr>
@@ -1808,7 +1807,7 @@
           </w:tcPr>
           <w:p>
             <w:pPr>
-              <w:spacing w:after="40" w:line="240" w:lineRule="auto"/>
+              <w:spacing w:after="40"/>
             </w:pPr>
             <w:r>
               <w:rPr>
@@ -1830,7 +1829,7 @@
           </w:tcPr>
           <w:p>
             <w:pPr>
-              <w:spacing w:after="40" w:line="240" w:lineRule="auto"/>
+              <w:spacing w:after="40"/>
             </w:pPr>
             <w:r>
               <w:rPr>
@@ -1847,7 +1846,7 @@
           </w:tcPr>
           <w:p>
             <w:pPr>
-              <w:spacing w:after="40" w:line="240" w:lineRule="auto"/>
+              <w:spacing w:after="40"/>
             </w:pPr>
             <w:r>
               <w:rPr>
@@ -1864,7 +1863,7 @@
           </w:tcPr>
           <w:p>
             <w:pPr>
-              <w:spacing w:after="40" w:line="240" w:lineRule="auto"/>
+              <w:spacing w:after="40"/>
             </w:pPr>
             <w:r>
               <w:rPr>
@@ -1885,7 +1884,7 @@
           </w:tcPr>
           <w:p>
             <w:pPr>
-              <w:spacing w:after="40" w:line="240" w:lineRule="auto"/>
+              <w:spacing w:after="40"/>
             </w:pPr>
             <w:r>
               <w:rPr>
@@ -1901,7 +1900,7 @@
           </w:tcPr>
           <w:p>
             <w:pPr>
-              <w:spacing w:after="40" w:line="240" w:lineRule="auto"/>
+              <w:spacing w:after="40"/>
             </w:pPr>
             <w:r>
               <w:rPr>
@@ -1917,7 +1916,7 @@
           </w:tcPr>
           <w:p>
             <w:pPr>
-              <w:spacing w:after="40" w:line="240" w:lineRule="auto"/>
+              <w:spacing w:after="40"/>
             </w:pPr>
             <w:r>
               <w:rPr>
@@ -1939,7 +1938,7 @@
           </w:tcPr>
           <w:p>
             <w:pPr>
-              <w:spacing w:after="40" w:line="240" w:lineRule="auto"/>
+              <w:spacing w:after="40"/>
             </w:pPr>
             <w:r>
               <w:rPr>
@@ -1956,7 +1955,7 @@
           </w:tcPr>
           <w:p>
             <w:pPr>
-              <w:spacing w:after="40" w:line="240" w:lineRule="auto"/>
+              <w:spacing w:after="40"/>
             </w:pPr>
             <w:r>
               <w:rPr>
@@ -1973,7 +1972,7 @@
           </w:tcPr>
           <w:p>
             <w:pPr>
-              <w:spacing w:after="40" w:line="240" w:lineRule="auto"/>
+              <w:spacing w:after="40"/>
             </w:pPr>
             <w:r>
               <w:rPr>
@@ -1994,7 +1993,7 @@
           </w:tcPr>
           <w:p>
             <w:pPr>
-              <w:spacing w:after="40" w:line="240" w:lineRule="auto"/>
+              <w:spacing w:after="40"/>
             </w:pPr>
             <w:r>
               <w:rPr>
@@ -2010,7 +2009,7 @@
           </w:tcPr>
           <w:p>
             <w:pPr>
-              <w:spacing w:after="40" w:line="240" w:lineRule="auto"/>
+              <w:spacing w:after="40"/>
             </w:pPr>
             <w:r>
               <w:rPr>
@@ -2026,7 +2025,7 @@
           </w:tcPr>
           <w:p>
             <w:pPr>
-              <w:spacing w:after="40" w:line="240" w:lineRule="auto"/>
+              <w:spacing w:after="40"/>
             </w:pPr>
             <w:r>
               <w:rPr>
@@ -2048,7 +2047,7 @@
           </w:tcPr>
           <w:p>
             <w:pPr>
-              <w:spacing w:after="40" w:line="240" w:lineRule="auto"/>
+              <w:spacing w:after="40"/>
             </w:pPr>
             <w:r>
               <w:rPr>
@@ -2065,7 +2064,7 @@
           </w:tcPr>
           <w:p>
             <w:pPr>
-              <w:spacing w:after="40" w:line="240" w:lineRule="auto"/>
+              <w:spacing w:after="40"/>
             </w:pPr>
             <w:r>
               <w:rPr>
@@ -2082,7 +2081,7 @@
           </w:tcPr>
           <w:p>
             <w:pPr>
-              <w:spacing w:after="40" w:line="240" w:lineRule="auto"/>
+              <w:spacing w:after="40"/>
             </w:pPr>
             <w:r>
               <w:rPr>
@@ -2103,7 +2102,7 @@
           </w:tcPr>
           <w:p>
             <w:pPr>
-              <w:spacing w:after="40" w:line="240" w:lineRule="auto"/>
+              <w:spacing w:after="40"/>
             </w:pPr>
             <w:r>
               <w:rPr>
@@ -2119,7 +2118,7 @@
           </w:tcPr>
           <w:p>
             <w:pPr>
-              <w:spacing w:after="40" w:line="240" w:lineRule="auto"/>
+              <w:spacing w:after="40"/>
             </w:pPr>
             <w:r>
               <w:rPr>
@@ -2135,7 +2134,7 @@
           </w:tcPr>
           <w:p>
             <w:pPr>
-              <w:spacing w:after="40" w:line="240" w:lineRule="auto"/>
+              <w:spacing w:after="40"/>
             </w:pPr>
             <w:r>
               <w:rPr>
@@ -2157,7 +2156,7 @@
           </w:tcPr>
           <w:p>
             <w:pPr>
-              <w:spacing w:after="40" w:line="240" w:lineRule="auto"/>
+              <w:spacing w:after="40"/>
             </w:pPr>
             <w:r>
               <w:rPr>
@@ -2174,7 +2173,7 @@
           </w:tcPr>
           <w:p>
             <w:pPr>
-              <w:spacing w:after="40" w:line="240" w:lineRule="auto"/>
+              <w:spacing w:after="40"/>
             </w:pPr>
             <w:r>
               <w:rPr>
@@ -2191,7 +2190,7 @@
           </w:tcPr>
           <w:p>
             <w:pPr>
-              <w:spacing w:after="40" w:line="240" w:lineRule="auto"/>
+              <w:spacing w:after="40"/>
             </w:pPr>
             <w:r>
               <w:rPr>
@@ -2212,7 +2211,7 @@
           </w:tcPr>
           <w:p>
             <w:pPr>
-              <w:spacing w:after="40" w:line="240" w:lineRule="auto"/>
+              <w:spacing w:after="40"/>
             </w:pPr>
             <w:r>
               <w:rPr>
@@ -2228,7 +2227,7 @@
           </w:tcPr>
           <w:p>
             <w:pPr>
-              <w:spacing w:after="40" w:line="240" w:lineRule="auto"/>
+              <w:spacing w:after="40"/>
             </w:pPr>
             <w:r>
               <w:rPr>
@@ -2244,7 +2243,7 @@
           </w:tcPr>
           <w:p>
             <w:pPr>
-              <w:spacing w:after="40" w:line="240" w:lineRule="auto"/>
+              <w:spacing w:after="40"/>
             </w:pPr>
             <w:r>
               <w:rPr>
@@ -2266,7 +2265,7 @@
           </w:tcPr>
           <w:p>
             <w:pPr>
-              <w:spacing w:after="40" w:line="240" w:lineRule="auto"/>
+              <w:spacing w:after="40"/>
             </w:pPr>
             <w:r>
               <w:rPr>
@@ -2283,7 +2282,7 @@
           </w:tcPr>
           <w:p>
             <w:pPr>
-              <w:spacing w:after="40" w:line="240" w:lineRule="auto"/>
+              <w:spacing w:after="40"/>
             </w:pPr>
             <w:r>
               <w:rPr>
@@ -2300,7 +2299,7 @@
           </w:tcPr>
           <w:p>
             <w:pPr>
-              <w:spacing w:after="40" w:line="240" w:lineRule="auto"/>
+              <w:spacing w:after="40"/>
             </w:pPr>
             <w:r>
               <w:rPr>
@@ -2321,7 +2320,7 @@
           </w:tcPr>
           <w:p>
             <w:pPr>
-              <w:spacing w:after="40" w:line="240" w:lineRule="auto"/>
+              <w:spacing w:after="40"/>
             </w:pPr>
             <w:r>
               <w:rPr>
@@ -2337,7 +2336,7 @@
           </w:tcPr>
           <w:p>
             <w:pPr>
-              <w:spacing w:after="40" w:line="240" w:lineRule="auto"/>
+              <w:spacing w:after="40"/>
             </w:pPr>
             <w:r>
               <w:rPr>
@@ -2353,7 +2352,7 @@
           </w:tcPr>
           <w:p>
             <w:pPr>
-              <w:spacing w:after="40" w:line="240" w:lineRule="auto"/>
+              <w:spacing w:after="40"/>
             </w:pPr>
             <w:r>
               <w:rPr>
@@ -2375,7 +2374,7 @@
           </w:tcPr>
           <w:p>
             <w:pPr>
-              <w:spacing w:after="40" w:line="240" w:lineRule="auto"/>
+              <w:spacing w:after="40"/>
             </w:pPr>
             <w:r>
               <w:rPr>
@@ -2392,7 +2391,7 @@
           </w:tcPr>
           <w:p>
             <w:pPr>
-              <w:spacing w:after="40" w:line="240" w:lineRule="auto"/>
+              <w:spacing w:after="40"/>
             </w:pPr>
             <w:r>
               <w:rPr>
@@ -2409,7 +2408,7 @@
           </w:tcPr>
           <w:p>
             <w:pPr>
-              <w:spacing w:after="40" w:line="240" w:lineRule="auto"/>
+              <w:spacing w:after="40"/>
             </w:pPr>
             <w:r>
               <w:rPr>
@@ -2430,7 +2429,7 @@
           </w:tcPr>
           <w:p>
             <w:pPr>
-              <w:spacing w:after="40" w:line="240" w:lineRule="auto"/>
+              <w:spacing w:after="40"/>
             </w:pPr>
             <w:r>
               <w:rPr>
@@ -2446,7 +2445,7 @@
           </w:tcPr>
           <w:p>
             <w:pPr>
-              <w:spacing w:after="40" w:line="240" w:lineRule="auto"/>
+              <w:spacing w:after="40"/>
             </w:pPr>
             <w:r>
               <w:rPr>
@@ -2462,7 +2461,7 @@
           </w:tcPr>
           <w:p>
             <w:pPr>
-              <w:spacing w:after="40" w:line="240" w:lineRule="auto"/>
+              <w:spacing w:after="40"/>
             </w:pPr>
             <w:r>
               <w:rPr>
@@ -2484,7 +2483,7 @@
           </w:tcPr>
           <w:p>
             <w:pPr>
-              <w:spacing w:after="40" w:line="240" w:lineRule="auto"/>
+              <w:spacing w:after="40"/>
             </w:pPr>
             <w:r>
               <w:rPr>
@@ -2501,7 +2500,7 @@
           </w:tcPr>
           <w:p>
             <w:pPr>
-              <w:spacing w:after="40" w:line="240" w:lineRule="auto"/>
+              <w:spacing w:after="40"/>
             </w:pPr>
             <w:r>
               <w:rPr>
@@ -2518,7 +2517,7 @@
           </w:tcPr>
           <w:p>
             <w:pPr>
-              <w:spacing w:after="40" w:line="240" w:lineRule="auto"/>
+              <w:spacing w:after="40"/>
             </w:pPr>
             <w:r>
               <w:rPr>
@@ -2539,7 +2538,7 @@
           </w:tcPr>
           <w:p>
             <w:pPr>
-              <w:spacing w:after="40" w:line="240" w:lineRule="auto"/>
+              <w:spacing w:after="40"/>
             </w:pPr>
             <w:r>
               <w:rPr>
@@ -2555,7 +2554,7 @@
           </w:tcPr>
           <w:p>
             <w:pPr>
-              <w:spacing w:after="40" w:line="240" w:lineRule="auto"/>
+              <w:spacing w:after="40"/>
             </w:pPr>
             <w:r>
               <w:rPr>
@@ -2571,7 +2570,7 @@
           </w:tcPr>
           <w:p>
             <w:pPr>
-              <w:spacing w:after="40" w:line="240" w:lineRule="auto"/>
+              <w:spacing w:after="40"/>
             </w:pPr>
             <w:r>
               <w:rPr>
@@ -2593,7 +2592,7 @@
           </w:tcPr>
           <w:p>
             <w:pPr>
-              <w:spacing w:after="40" w:line="240" w:lineRule="auto"/>
+              <w:spacing w:after="40"/>
             </w:pPr>
             <w:r>
               <w:rPr>
@@ -2610,7 +2609,7 @@
           </w:tcPr>
           <w:p>
             <w:pPr>
-              <w:spacing w:after="40" w:line="240" w:lineRule="auto"/>
+              <w:spacing w:after="40"/>
             </w:pPr>
             <w:r>
               <w:rPr>
@@ -2627,7 +2626,7 @@
           </w:tcPr>
           <w:p>
             <w:pPr>
-              <w:spacing w:after="40" w:line="240" w:lineRule="auto"/>
+              <w:spacing w:after="40"/>
             </w:pPr>
             <w:r>
               <w:rPr>
@@ -2648,7 +2647,7 @@
           </w:tcPr>
           <w:p>
             <w:pPr>
-              <w:spacing w:after="40" w:line="240" w:lineRule="auto"/>
+              <w:spacing w:after="40"/>
             </w:pPr>
             <w:r>
               <w:rPr>
@@ -2664,7 +2663,7 @@
           </w:tcPr>
           <w:p>
             <w:pPr>
-              <w:spacing w:after="40" w:line="240" w:lineRule="auto"/>
+              <w:spacing w:after="40"/>
             </w:pPr>
             <w:r>
               <w:rPr>
@@ -2680,7 +2679,7 @@
           </w:tcPr>
           <w:p>
             <w:pPr>
-              <w:spacing w:after="40" w:line="240" w:lineRule="auto"/>
+              <w:spacing w:after="40"/>
             </w:pPr>
             <w:r>
               <w:rPr>
@@ -2702,7 +2701,7 @@
           </w:tcPr>
           <w:p>
             <w:pPr>
-              <w:spacing w:after="40" w:line="240" w:lineRule="auto"/>
+              <w:spacing w:after="40"/>
             </w:pPr>
             <w:r>
               <w:rPr>
@@ -2719,7 +2718,7 @@
           </w:tcPr>
           <w:p>
             <w:pPr>
-              <w:spacing w:after="40" w:line="240" w:lineRule="auto"/>
+              <w:spacing w:after="40"/>
             </w:pPr>
             <w:r>
               <w:rPr>
@@ -2736,7 +2735,7 @@
           </w:tcPr>
           <w:p>
             <w:pPr>
-              <w:spacing w:after="40" w:line="240" w:lineRule="auto"/>
+              <w:spacing w:after="40"/>
             </w:pPr>
             <w:r>
               <w:rPr>
@@ -3046,7 +3045,7 @@
           </w:tcPr>
           <w:p>
             <w:pPr>
-              <w:spacing w:after="40" w:line="240" w:lineRule="auto"/>
+              <w:spacing w:after="40"/>
             </w:pPr>
             <w:r>
               <w:rPr>
@@ -3062,7 +3061,7 @@
           </w:tcPr>
           <w:p>
             <w:pPr>
-              <w:spacing w:after="40" w:line="240" w:lineRule="auto"/>
+              <w:spacing w:after="40"/>
             </w:pPr>
             <w:r>
               <w:rPr>
@@ -3084,13 +3083,12 @@
           </w:tcPr>
           <w:p>
             <w:pPr>
-              <w:spacing w:after="40" w:line="240" w:lineRule="auto"/>
+              <w:spacing w:after="40"/>
             </w:pPr>
             <w:r>
               <w:rPr>
                 <w:sz w:val="18"/>
               </w:rPr>
-              <w:lastRenderedPageBreak/>
               <w:t>A 1sd or unlabelled sd column</w:t>
             </w:r>
           </w:p>
@@ -3102,13 +3100,20 @@
           </w:tcPr>
           <w:p>
             <w:pPr>
-              <w:spacing w:after="40" w:line="240" w:lineRule="auto"/>
+              <w:spacing w:after="40"/>
             </w:pPr>
             <w:r>
               <w:rPr>
                 <w:sz w:val="18"/>
               </w:rPr>
-              <w:t>Doubled. An unlabelled error column is assumed to be 1sd, which is the common convention; the assumption is stated in column Y.</w:t>
+              <w:t xml:space="preserve">Doubled. An unlabelled error column is assumed to be 1sd, which is the common </w:t>
+            </w:r>
+            <w:r>
+              <w:rPr>
+                <w:sz w:val="18"/>
+              </w:rPr>
+              <w:lastRenderedPageBreak/>
+              <w:t>convention; the assumption is stated in column Y.</w:t>
             </w:r>
           </w:p>
         </w:tc>
@@ -3123,12 +3128,13 @@
           </w:tcPr>
           <w:p>
             <w:pPr>
-              <w:spacing w:after="40" w:line="240" w:lineRule="auto"/>
+              <w:spacing w:after="40"/>
             </w:pPr>
             <w:r>
               <w:rPr>
                 <w:sz w:val="18"/>
               </w:rPr>
+              <w:lastRenderedPageBreak/>
               <w:t>A 90% credible interval (Bayesian calibration)</w:t>
             </w:r>
           </w:p>
@@ -3139,7 +3145,7 @@
           </w:tcPr>
           <w:p>
             <w:pPr>
-              <w:spacing w:after="40" w:line="240" w:lineRule="auto"/>
+              <w:spacing w:after="40"/>
             </w:pPr>
             <w:r>
               <w:rPr>
@@ -3161,7 +3167,7 @@
           </w:tcPr>
           <w:p>
             <w:pPr>
-              <w:spacing w:after="40" w:line="240" w:lineRule="auto"/>
+              <w:spacing w:after="40"/>
             </w:pPr>
             <w:r>
               <w:rPr>
@@ -3178,7 +3184,7 @@
           </w:tcPr>
           <w:p>
             <w:pPr>
-              <w:spacing w:after="40" w:line="240" w:lineRule="auto"/>
+              <w:spacing w:after="40"/>
             </w:pPr>
             <w:r>
               <w:rPr>
@@ -3200,7 +3206,7 @@
           </w:tcPr>
           <w:p>
             <w:pPr>
-              <w:spacing w:after="40" w:line="240" w:lineRule="auto"/>
+              <w:spacing w:after="40"/>
             </w:pPr>
             <w:r>
               <w:rPr>
@@ -3217,7 +3223,7 @@
           </w:tcPr>
           <w:p>
             <w:pPr>
-              <w:spacing w:after="40" w:line="240" w:lineRule="auto"/>
+              <w:spacing w:after="40"/>
             </w:pPr>
             <w:r>
               <w:rPr>
@@ -3484,7 +3490,7 @@
           </w:tcPr>
           <w:p>
             <w:pPr>
-              <w:spacing w:after="40" w:line="240" w:lineRule="auto"/>
+              <w:spacing w:after="40"/>
             </w:pPr>
             <w:r>
               <w:rPr>
@@ -3500,7 +3506,7 @@
           </w:tcPr>
           <w:p>
             <w:pPr>
-              <w:spacing w:after="40" w:line="240" w:lineRule="auto"/>
+              <w:spacing w:after="40"/>
             </w:pPr>
             <w:r>
               <w:rPr>
@@ -3522,7 +3528,7 @@
           </w:tcPr>
           <w:p>
             <w:pPr>
-              <w:spacing w:after="40" w:line="240" w:lineRule="auto"/>
+              <w:spacing w:after="40"/>
             </w:pPr>
             <w:r>
               <w:rPr>
@@ -3539,7 +3545,7 @@
           </w:tcPr>
           <w:p>
             <w:pPr>
-              <w:spacing w:after="40" w:line="240" w:lineRule="auto"/>
+              <w:spacing w:after="40"/>
             </w:pPr>
             <w:r>
               <w:rPr>
@@ -3561,7 +3567,7 @@
           </w:tcPr>
           <w:p>
             <w:pPr>
-              <w:spacing w:after="40" w:line="240" w:lineRule="auto"/>
+              <w:spacing w:after="40"/>
             </w:pPr>
             <w:r>
               <w:rPr>
@@ -3578,7 +3584,7 @@
           </w:tcPr>
           <w:p>
             <w:pPr>
-              <w:spacing w:after="40" w:line="240" w:lineRule="auto"/>
+              <w:spacing w:after="40"/>
             </w:pPr>
             <w:r>
               <w:rPr>
@@ -3599,7 +3605,7 @@
           </w:tcPr>
           <w:p>
             <w:pPr>
-              <w:spacing w:after="40" w:line="240" w:lineRule="auto"/>
+              <w:spacing w:after="40"/>
             </w:pPr>
             <w:r>
               <w:rPr>
@@ -3615,7 +3621,7 @@
           </w:tcPr>
           <w:p>
             <w:pPr>
-              <w:spacing w:after="40" w:line="240" w:lineRule="auto"/>
+              <w:spacing w:after="40"/>
             </w:pPr>
             <w:r>
               <w:rPr>
@@ -3637,7 +3643,7 @@
           </w:tcPr>
           <w:p>
             <w:pPr>
-              <w:spacing w:after="40" w:line="240" w:lineRule="auto"/>
+              <w:spacing w:after="40"/>
             </w:pPr>
             <w:r>
               <w:rPr>
@@ -3654,7 +3660,7 @@
           </w:tcPr>
           <w:p>
             <w:pPr>
-              <w:spacing w:after="40" w:line="240" w:lineRule="auto"/>
+              <w:spacing w:after="40"/>
             </w:pPr>
             <w:r>
               <w:rPr>
@@ -3675,7 +3681,7 @@
           </w:tcPr>
           <w:p>
             <w:pPr>
-              <w:spacing w:after="40" w:line="240" w:lineRule="auto"/>
+              <w:spacing w:after="40"/>
             </w:pPr>
             <w:r>
               <w:rPr>
@@ -3691,7 +3697,7 @@
           </w:tcPr>
           <w:p>
             <w:pPr>
-              <w:spacing w:after="40" w:line="240" w:lineRule="auto"/>
+              <w:spacing w:after="40"/>
             </w:pPr>
             <w:r>
               <w:rPr>

</xml_diff>